<commit_message>
feat: expand SI scope and analytical workflows
</commit_message>
<xml_diff>
--- a/src/si_generator/templates/Crystallography_template.docx
+++ b/src/si_generator/templates/Crystallography_template.docx
@@ -4,10 +4,13 @@
   <w:body>
     <w:p>
       <w:pPr>
-        <w:pStyle w:val="Heading1"/>
+        <w:keepNext/>
       </w:pPr>
       <w:r>
-        <w:t>Crystallographic data for {Product.number}</w:t>
+        <w:rPr>
+          <w:b/>
+        </w:rPr>
+        <w:t>{Product.name} ({Product.number})</w:t>
       </w:r>
     </w:p>
     <w:p>
@@ -398,6 +401,9 @@
     <w:name w:val="Normal"/>
     <w:qFormat/>
     <w:rsid w:val="00FC693F"/>
+    <w:pPr>
+      <w:spacing w:after="120" w:line="276" w:lineRule="auto"/>
+    </w:pPr>
     <w:rPr>
       <w:rFonts w:ascii="Times New Roman" w:hAnsi="Times New Roman"/>
       <w:color w:val="000000"/>
@@ -467,7 +473,7 @@
       <w:b/>
       <w:bCs/>
       <w:color w:val="000000"/>
-      <w:sz w:val="24"/>
+      <w:sz w:val="28"/>
       <w:szCs w:val="28"/>
     </w:rPr>
   </w:style>
@@ -487,10 +493,10 @@
       <w:outlineLvl w:val="1"/>
     </w:pPr>
     <w:rPr>
-      <w:rFonts w:asciiTheme="majorHAnsi" w:eastAsiaTheme="majorEastAsia" w:hAnsiTheme="majorHAnsi" w:cstheme="majorBidi"/>
+      <w:rFonts w:asciiTheme="majorHAnsi" w:eastAsiaTheme="majorEastAsia" w:hAnsiTheme="majorHAnsi" w:cstheme="majorBidi" w:ascii="Times New Roman" w:hAnsi="Times New Roman"/>
       <w:b/>
       <w:bCs/>
-      <w:color w:val="4F81BD" w:themeColor="accent1"/>
+      <w:color w:val="000000"/>
       <w:sz w:val="26"/>
       <w:szCs w:val="26"/>
     </w:rPr>
@@ -745,15 +751,12 @@
     <w:qFormat/>
     <w:rsid w:val="00FC693F"/>
     <w:pPr>
-      <w:pBdr>
-        <w:bottom w:val="single" w:sz="8" w:space="4" w:color="4F81BD" w:themeColor="accent1"/>
-      </w:pBdr>
       <w:spacing w:after="300" w:line="240" w:lineRule="auto"/>
       <w:contextualSpacing/>
     </w:pPr>
     <w:rPr>
-      <w:rFonts w:asciiTheme="majorHAnsi" w:eastAsiaTheme="majorEastAsia" w:hAnsiTheme="majorHAnsi" w:cstheme="majorBidi"/>
-      <w:color w:val="17365D" w:themeColor="text2" w:themeShade="BF"/>
+      <w:rFonts w:asciiTheme="majorHAnsi" w:eastAsiaTheme="majorEastAsia" w:hAnsiTheme="majorHAnsi" w:cstheme="majorBidi" w:ascii="Times New Roman" w:hAnsi="Times New Roman"/>
+      <w:color w:val="000000"/>
       <w:spacing w:val="5"/>
       <w:kern w:val="28"/>
       <w:sz w:val="52"/>
@@ -1232,9 +1235,6 @@
     <w:qFormat/>
     <w:rsid w:val="00FC693F"/>
     <w:pPr>
-      <w:pBdr>
-        <w:bottom w:val="single" w:sz="4" w:space="4" w:color="4F81BD" w:themeColor="accent1"/>
-      </w:pBdr>
       <w:spacing w:before="200" w:after="280"/>
       <w:ind w:left="936" w:right="936"/>
     </w:pPr>

</xml_diff>